<commit_message>
Updated Release Phase Gate secondary document (copy/paste errors)
</commit_message>
<xml_diff>
--- a/source/reference_documents/secondary_documents/release phase/Release Phase Gate/Release Phase Gate.docx
+++ b/source/reference_documents/secondary_documents/release phase/Release Phase Gate/Release Phase Gate.docx
@@ -1,6 +1,6 @@
 
 <file path=word/document.xml><?xml version="1.0" encoding="utf-8"?>
-<w:document xmlns:wpc="http://schemas.microsoft.com/office/word/2010/wordprocessingCanvas" xmlns:cx="http://schemas.microsoft.com/office/drawing/2014/chartex" xmlns:cx1="http://schemas.microsoft.com/office/drawing/2015/9/8/chartex" xmlns:cx2="http://schemas.microsoft.com/office/drawing/2015/10/21/chartex" xmlns:cx3="http://schemas.microsoft.com/office/drawing/2016/5/9/chartex" xmlns:cx4="http://schemas.microsoft.com/office/drawing/2016/5/10/chartex" xmlns:cx5="http://schemas.microsoft.com/office/drawing/2016/5/11/chartex" xmlns:cx6="http://schemas.microsoft.com/office/drawing/2016/5/12/chartex" xmlns:cx7="http://schemas.microsoft.com/office/drawing/2016/5/13/chartex" xmlns:cx8="http://schemas.microsoft.com/office/drawing/2016/5/14/chartex" xmlns:mc="http://schemas.openxmlformats.org/markup-compatibility/2006" xmlns:aink="http://schemas.microsoft.com/office/drawing/2016/ink" xmlns:am3d="http://schemas.microsoft.com/office/drawing/2017/model3d" xmlns:o="urn:schemas-microsoft-com:office:office" xmlns:oel="http://schemas.microsoft.com/office/2019/extlst" xmlns:r="http://schemas.openxmlformats.org/officeDocument/2006/relationships" xmlns:m="http://schemas.openxmlformats.org/officeDocument/2006/math" xmlns:v="urn:schemas-microsoft-com:vml" xmlns:wp14="http://schemas.microsoft.com/office/word/2010/wordprocessingDrawing" xmlns:wp="http://schemas.openxmlformats.org/drawingml/2006/wordprocessingDrawing" xmlns:w10="urn:schemas-microsoft-com:office:word" xmlns:w="http://schemas.openxmlformats.org/wordprocessingml/2006/main" xmlns:w14="http://schemas.microsoft.com/office/word/2010/wordml" xmlns:w15="http://schemas.microsoft.com/office/word/2012/wordml" xmlns:w16cex="http://schemas.microsoft.com/office/word/2018/wordml/cex" xmlns:w16cid="http://schemas.microsoft.com/office/word/2016/wordml/cid" xmlns:w16="http://schemas.microsoft.com/office/word/2018/wordml" xmlns:w16sdtdh="http://schemas.microsoft.com/office/word/2020/wordml/sdtdatahash" xmlns:w16se="http://schemas.microsoft.com/office/word/2015/wordml/symex" xmlns:wpg="http://schemas.microsoft.com/office/word/2010/wordprocessingGroup" xmlns:wpi="http://schemas.microsoft.com/office/word/2010/wordprocessingInk" xmlns:wne="http://schemas.microsoft.com/office/word/2006/wordml" xmlns:wps="http://schemas.microsoft.com/office/word/2010/wordprocessingShape" mc:Ignorable="w14 w15 w16se w16cid w16 w16cex w16sdtdh wp14">
+<w:document xmlns:wpc="http://schemas.microsoft.com/office/word/2010/wordprocessingCanvas" xmlns:cx="http://schemas.microsoft.com/office/drawing/2014/chartex" xmlns:cx1="http://schemas.microsoft.com/office/drawing/2015/9/8/chartex" xmlns:cx2="http://schemas.microsoft.com/office/drawing/2015/10/21/chartex" xmlns:cx3="http://schemas.microsoft.com/office/drawing/2016/5/9/chartex" xmlns:cx4="http://schemas.microsoft.com/office/drawing/2016/5/10/chartex" xmlns:cx5="http://schemas.microsoft.com/office/drawing/2016/5/11/chartex" xmlns:cx6="http://schemas.microsoft.com/office/drawing/2016/5/12/chartex" xmlns:cx7="http://schemas.microsoft.com/office/drawing/2016/5/13/chartex" xmlns:cx8="http://schemas.microsoft.com/office/drawing/2016/5/14/chartex" xmlns:mc="http://schemas.openxmlformats.org/markup-compatibility/2006" xmlns:aink="http://schemas.microsoft.com/office/drawing/2016/ink" xmlns:am3d="http://schemas.microsoft.com/office/drawing/2017/model3d" xmlns:o="urn:schemas-microsoft-com:office:office" xmlns:oel="http://schemas.microsoft.com/office/2019/extlst" xmlns:r="http://schemas.openxmlformats.org/officeDocument/2006/relationships" xmlns:m="http://schemas.openxmlformats.org/officeDocument/2006/math" xmlns:v="urn:schemas-microsoft-com:vml" xmlns:wp14="http://schemas.microsoft.com/office/word/2010/wordprocessingDrawing" xmlns:wp="http://schemas.openxmlformats.org/drawingml/2006/wordprocessingDrawing" xmlns:w10="urn:schemas-microsoft-com:office:word" xmlns:w="http://schemas.openxmlformats.org/wordprocessingml/2006/main" xmlns:w14="http://schemas.microsoft.com/office/word/2010/wordml" xmlns:w15="http://schemas.microsoft.com/office/word/2012/wordml" xmlns:w16cex="http://schemas.microsoft.com/office/word/2018/wordml/cex" xmlns:w16cid="http://schemas.microsoft.com/office/word/2016/wordml/cid" xmlns:w16="http://schemas.microsoft.com/office/word/2018/wordml" xmlns:w16du="http://schemas.microsoft.com/office/word/2023/wordml/word16du" xmlns:w16sdtdh="http://schemas.microsoft.com/office/word/2020/wordml/sdtdatahash" xmlns:w16sdtfl="http://schemas.microsoft.com/office/word/2024/wordml/sdtformatlock" xmlns:w16se="http://schemas.microsoft.com/office/word/2015/wordml/symex" xmlns:wpg="http://schemas.microsoft.com/office/word/2010/wordprocessingGroup" xmlns:wpi="http://schemas.microsoft.com/office/word/2010/wordprocessingInk" xmlns:wne="http://schemas.microsoft.com/office/word/2006/wordml" xmlns:wps="http://schemas.microsoft.com/office/word/2010/wordprocessingShape" mc:Ignorable="w14 w15 w16se w16cid w16 w16cex w16sdtdh w16sdtfl w16du wp14">
   <w:body>
     <w:p>
       <w:pPr>
@@ -28,7 +28,7 @@
         <w:t xml:space="preserve">Version </w:t>
       </w:r>
       <w:r>
-        <w:t>4</w:t>
+        <w:t>5</w:t>
       </w:r>
     </w:p>
     <w:p>
@@ -45,7 +45,7 @@
         <w:rPr>
           <w:noProof/>
         </w:rPr>
-        <w:t>9/8/23 12:53 PM</w:t>
+        <w:t>4/9/26 9:46 AM</w:t>
       </w:r>
       <w:r>
         <w:fldChar w:fldCharType="end"/>
@@ -136,43 +136,181 @@
     </w:p>
     <w:p>
       <w:pPr>
+        <w:spacing w:after="240"/>
         <w:jc w:val="both"/>
       </w:pPr>
       <w:r>
-        <w:t xml:space="preserve">This document is motivated by the need to have formal processes in place for the verification and sign-off of phase products necessary for the creation of certification work products required for the certification safety-critical, cyber-physical systems, such as </w:t>
-      </w:r>
+        <w:t xml:space="preserve">This document is motivated by the need to have formal processes in place for the verification and sign-off of phase products necessary for the creation of certification work products required </w:t>
+      </w:r>
+      <w:r>
+        <w:t>by</w:t>
+      </w:r>
+      <w:r>
+        <w:t xml:space="preserve"> safety-critical, cyber-physical systems</w:t>
+      </w:r>
+      <w:r>
+        <w:t>.</w:t>
+      </w:r>
+    </w:p>
+    <w:p>
+      <w:pPr>
+        <w:tabs>
+          <w:tab w:val="left" w:pos="720"/>
+          <w:tab w:val="left" w:pos="1120"/>
+          <w:tab w:val="left" w:pos="1680"/>
+          <w:tab w:val="left" w:pos="2240"/>
+          <w:tab w:val="left" w:pos="2800"/>
+          <w:tab w:val="left" w:pos="3360"/>
+          <w:tab w:val="left" w:pos="3920"/>
+          <w:tab w:val="left" w:pos="4480"/>
+          <w:tab w:val="left" w:pos="5040"/>
+          <w:tab w:val="left" w:pos="5600"/>
+          <w:tab w:val="left" w:pos="6160"/>
+          <w:tab w:val="left" w:pos="6720"/>
+        </w:tabs>
+        <w:autoSpaceDE w:val="0"/>
+        <w:autoSpaceDN w:val="0"/>
+        <w:adjustRightInd w:val="0"/>
+        <w:spacing w:line="240" w:lineRule="auto"/>
+        <w:ind w:left="720" w:hanging="720"/>
+        <w:jc w:val="both"/>
+        <w:rPr>
+          <w:color w:val="000000"/>
+          <w:lang w:val="en-US"/>
+        </w:rPr>
+      </w:pPr>
       <w:r>
         <w:rPr>
           <w:b/>
           <w:bCs/>
-        </w:rPr>
-        <w:t>ISO</w:t>
+          <w:color w:val="0B5AB2"/>
+          <w:lang w:val="en-US"/>
+        </w:rPr>
+        <w:t>Note:</w:t>
+      </w:r>
+      <w:r>
+        <w:rPr>
+          <w:color w:val="000000"/>
+          <w:lang w:val="en-US"/>
+        </w:rPr>
+        <w:tab/>
+      </w:r>
+      <w:r>
+        <w:rPr>
+          <w:color w:val="000000"/>
+          <w:lang w:val="en-US"/>
+        </w:rPr>
+        <w:t xml:space="preserve">Within the context of this document, the terms </w:t>
       </w:r>
       <w:r>
         <w:rPr>
           <w:b/>
           <w:bCs/>
-        </w:rPr>
-        <w:t>/SAE</w:t>
+          <w:i/>
+          <w:iCs/>
+          <w:color w:val="000000"/>
+          <w:lang w:val="en-US"/>
+        </w:rPr>
+        <w:t>security</w:t>
+      </w:r>
+      <w:r>
+        <w:rPr>
+          <w:color w:val="000000"/>
+          <w:lang w:val="en-US"/>
+        </w:rPr>
+        <w:t xml:space="preserve"> and </w:t>
       </w:r>
       <w:r>
         <w:rPr>
           <w:b/>
           <w:bCs/>
-        </w:rPr>
-        <w:t xml:space="preserve"> 21434</w:t>
-      </w:r>
-      <w:r>
-        <w:t xml:space="preserve"> and </w:t>
+          <w:i/>
+          <w:iCs/>
+          <w:color w:val="000000"/>
+          <w:lang w:val="en-US"/>
+        </w:rPr>
+        <w:t>cybersecurity</w:t>
+      </w:r>
+      <w:r>
+        <w:rPr>
+          <w:color w:val="000000"/>
+          <w:lang w:val="en-US"/>
+        </w:rPr>
+        <w:t xml:space="preserve"> are used</w:t>
+      </w:r>
+      <w:r>
+        <w:rPr>
+          <w:color w:val="000000"/>
+          <w:lang w:val="en-US"/>
+        </w:rPr>
+        <w:t xml:space="preserve"> </w:t>
+      </w:r>
+      <w:r>
+        <w:rPr>
+          <w:color w:val="000000"/>
+          <w:lang w:val="en-US"/>
+        </w:rPr>
+        <w:t xml:space="preserve">interchangeably. It is presumed that the term </w:t>
       </w:r>
       <w:r>
         <w:rPr>
           <w:b/>
           <w:bCs/>
-        </w:rPr>
-        <w:t>ISO 26262</w:t>
-      </w:r>
-      <w:r>
+          <w:i/>
+          <w:iCs/>
+          <w:color w:val="000000"/>
+          <w:lang w:val="en-US"/>
+        </w:rPr>
+        <w:t>security</w:t>
+      </w:r>
+      <w:r>
+        <w:rPr>
+          <w:color w:val="000000"/>
+          <w:lang w:val="en-US"/>
+        </w:rPr>
+        <w:t xml:space="preserve"> is being used in reference to</w:t>
+      </w:r>
+      <w:r>
+        <w:rPr>
+          <w:color w:val="000000"/>
+          <w:lang w:val="en-US"/>
+        </w:rPr>
+        <w:t xml:space="preserve"> </w:t>
+      </w:r>
+      <w:r>
+        <w:rPr>
+          <w:b/>
+          <w:bCs/>
+          <w:i/>
+          <w:iCs/>
+          <w:color w:val="000000"/>
+          <w:lang w:val="en-US"/>
+        </w:rPr>
+        <w:t>cybersecurity</w:t>
+      </w:r>
+      <w:r>
+        <w:rPr>
+          <w:color w:val="000000"/>
+          <w:lang w:val="en-US"/>
+        </w:rPr>
+        <w:t xml:space="preserve"> and not </w:t>
+      </w:r>
+      <w:r>
+        <w:rPr>
+          <w:b/>
+          <w:bCs/>
+          <w:i/>
+          <w:iCs/>
+          <w:color w:val="000000"/>
+          <w:lang w:val="en-US"/>
+        </w:rPr>
+        <w:t>physical security</w:t>
+      </w:r>
+      <w:r>
+        <w:rPr>
+          <w:color w:val="000000"/>
+          <w:lang w:val="en-US"/>
+        </w:rPr>
         <w:t>.</w:t>
       </w:r>
     </w:p>
@@ -201,7 +339,19 @@
         <w:rPr>
           <w:lang w:val="en-US"/>
         </w:rPr>
-        <w:t xml:space="preserve">was created by </w:t>
+        <w:t xml:space="preserve">was </w:t>
+      </w:r>
+      <w:r>
+        <w:rPr>
+          <w:lang w:val="en-US"/>
+        </w:rPr>
+        <w:t xml:space="preserve">originally </w:t>
+      </w:r>
+      <w:r>
+        <w:rPr>
+          <w:lang w:val="en-US"/>
+        </w:rPr>
+        <w:t xml:space="preserve">created by </w:t>
       </w:r>
       <w:r>
         <w:rPr>
@@ -229,7 +379,23 @@
           <w:bCs/>
           <w:lang w:val="en-US"/>
         </w:rPr>
-        <w:t>Creative Commons Attribution-Share Alike (CC-SA</w:t>
+        <w:t>Creative Commons Attribution-Share Alike (CC</w:t>
+      </w:r>
+      <w:r>
+        <w:rPr>
+          <w:b/>
+          <w:bCs/>
+          <w:lang w:val="en-US"/>
+        </w:rPr>
+        <w:t xml:space="preserve"> BY</w:t>
+      </w:r>
+      <w:r>
+        <w:rPr>
+          <w:b/>
+          <w:bCs/>
+          <w:lang w:val="en-US"/>
+        </w:rPr>
+        <w:t>-SA</w:t>
       </w:r>
       <w:r>
         <w:rPr>
@@ -594,7 +760,6 @@
         <w:tc>
           <w:tcPr>
             <w:tcW w:w="1520" w:type="dxa"/>
-            <w:shd w:val="clear" w:color="auto" w:fill="auto"/>
             <w:tcMar>
               <w:top w:w="100" w:type="dxa"/>
               <w:left w:w="100" w:type="dxa"/>
@@ -631,7 +796,6 @@
         <w:tc>
           <w:tcPr>
             <w:tcW w:w="4315" w:type="dxa"/>
-            <w:shd w:val="clear" w:color="auto" w:fill="auto"/>
             <w:tcMar>
               <w:top w:w="100" w:type="dxa"/>
               <w:left w:w="100" w:type="dxa"/>
@@ -652,7 +816,7 @@
               <w:spacing w:line="240" w:lineRule="auto"/>
             </w:pPr>
             <w:r>
-              <w:t>Fuzz Testing Report</w:t>
+              <w:t>Final Security Review Report</w:t>
             </w:r>
           </w:p>
         </w:tc>
@@ -661,7 +825,6 @@
         <w:tc>
           <w:tcPr>
             <w:tcW w:w="1520" w:type="dxa"/>
-            <w:shd w:val="clear" w:color="auto" w:fill="auto"/>
             <w:tcMar>
               <w:top w:w="100" w:type="dxa"/>
               <w:left w:w="100" w:type="dxa"/>
@@ -698,7 +861,6 @@
         <w:tc>
           <w:tcPr>
             <w:tcW w:w="4315" w:type="dxa"/>
-            <w:shd w:val="clear" w:color="auto" w:fill="auto"/>
             <w:tcMar>
               <w:top w:w="100" w:type="dxa"/>
               <w:left w:w="100" w:type="dxa"/>
@@ -728,7 +890,6 @@
         <w:tc>
           <w:tcPr>
             <w:tcW w:w="1520" w:type="dxa"/>
-            <w:shd w:val="clear" w:color="auto" w:fill="auto"/>
             <w:tcMar>
               <w:top w:w="100" w:type="dxa"/>
               <w:left w:w="100" w:type="dxa"/>
@@ -765,7 +926,6 @@
         <w:tc>
           <w:tcPr>
             <w:tcW w:w="4315" w:type="dxa"/>
-            <w:shd w:val="clear" w:color="auto" w:fill="auto"/>
             <w:tcMar>
               <w:top w:w="100" w:type="dxa"/>
               <w:left w:w="100" w:type="dxa"/>
@@ -841,7 +1001,6 @@
         <w:tc>
           <w:tcPr>
             <w:tcW w:w="1520" w:type="dxa"/>
-            <w:shd w:val="clear" w:color="auto" w:fill="auto"/>
             <w:tcMar>
               <w:top w:w="100" w:type="dxa"/>
               <w:left w:w="100" w:type="dxa"/>
@@ -878,7 +1037,6 @@
         <w:tc>
           <w:tcPr>
             <w:tcW w:w="4315" w:type="dxa"/>
-            <w:shd w:val="clear" w:color="auto" w:fill="auto"/>
             <w:tcMar>
               <w:top w:w="100" w:type="dxa"/>
               <w:left w:w="100" w:type="dxa"/>
@@ -899,7 +1057,7 @@
               <w:spacing w:line="240" w:lineRule="auto"/>
             </w:pPr>
             <w:r>
-              <w:t>Fuzz Testing Report</w:t>
+              <w:t>Archive Manifest</w:t>
             </w:r>
           </w:p>
         </w:tc>
@@ -908,7 +1066,6 @@
         <w:tc>
           <w:tcPr>
             <w:tcW w:w="1520" w:type="dxa"/>
-            <w:shd w:val="clear" w:color="auto" w:fill="auto"/>
             <w:tcMar>
               <w:top w:w="100" w:type="dxa"/>
               <w:left w:w="100" w:type="dxa"/>
@@ -945,7 +1102,6 @@
         <w:tc>
           <w:tcPr>
             <w:tcW w:w="4315" w:type="dxa"/>
-            <w:shd w:val="clear" w:color="auto" w:fill="auto"/>
             <w:tcMar>
               <w:top w:w="100" w:type="dxa"/>
               <w:left w:w="100" w:type="dxa"/>
@@ -975,7 +1131,6 @@
         <w:tc>
           <w:tcPr>
             <w:tcW w:w="1520" w:type="dxa"/>
-            <w:shd w:val="clear" w:color="auto" w:fill="auto"/>
             <w:tcMar>
               <w:top w:w="100" w:type="dxa"/>
               <w:left w:w="100" w:type="dxa"/>
@@ -1012,7 +1167,6 @@
         <w:tc>
           <w:tcPr>
             <w:tcW w:w="4315" w:type="dxa"/>
-            <w:shd w:val="clear" w:color="auto" w:fill="auto"/>
             <w:tcMar>
               <w:top w:w="100" w:type="dxa"/>
               <w:left w:w="100" w:type="dxa"/>
@@ -1088,7 +1242,6 @@
         <w:tc>
           <w:tcPr>
             <w:tcW w:w="1520" w:type="dxa"/>
-            <w:shd w:val="clear" w:color="auto" w:fill="auto"/>
             <w:tcMar>
               <w:top w:w="100" w:type="dxa"/>
               <w:left w:w="100" w:type="dxa"/>
@@ -1125,7 +1278,6 @@
         <w:tc>
           <w:tcPr>
             <w:tcW w:w="4315" w:type="dxa"/>
-            <w:shd w:val="clear" w:color="auto" w:fill="auto"/>
             <w:tcMar>
               <w:top w:w="100" w:type="dxa"/>
               <w:left w:w="100" w:type="dxa"/>
@@ -1155,7 +1307,6 @@
         <w:tc>
           <w:tcPr>
             <w:tcW w:w="1520" w:type="dxa"/>
-            <w:shd w:val="clear" w:color="auto" w:fill="auto"/>
             <w:tcMar>
               <w:top w:w="100" w:type="dxa"/>
               <w:left w:w="100" w:type="dxa"/>
@@ -1192,7 +1343,6 @@
         <w:tc>
           <w:tcPr>
             <w:tcW w:w="4315" w:type="dxa"/>
-            <w:shd w:val="clear" w:color="auto" w:fill="auto"/>
             <w:tcMar>
               <w:top w:w="100" w:type="dxa"/>
               <w:left w:w="100" w:type="dxa"/>
@@ -1222,7 +1372,6 @@
         <w:tc>
           <w:tcPr>
             <w:tcW w:w="1520" w:type="dxa"/>
-            <w:shd w:val="clear" w:color="auto" w:fill="auto"/>
             <w:tcMar>
               <w:top w:w="100" w:type="dxa"/>
               <w:left w:w="100" w:type="dxa"/>
@@ -1259,7 +1408,6 @@
         <w:tc>
           <w:tcPr>
             <w:tcW w:w="4315" w:type="dxa"/>
-            <w:shd w:val="clear" w:color="auto" w:fill="auto"/>
             <w:tcMar>
               <w:top w:w="100" w:type="dxa"/>
               <w:left w:w="100" w:type="dxa"/>
@@ -1337,7 +1485,6 @@
         <w:tc>
           <w:tcPr>
             <w:tcW w:w="1520" w:type="dxa"/>
-            <w:shd w:val="clear" w:color="auto" w:fill="auto"/>
             <w:tcMar>
               <w:top w:w="100" w:type="dxa"/>
               <w:left w:w="100" w:type="dxa"/>
@@ -1374,7 +1521,6 @@
         <w:tc>
           <w:tcPr>
             <w:tcW w:w="4315" w:type="dxa"/>
-            <w:shd w:val="clear" w:color="auto" w:fill="auto"/>
             <w:tcMar>
               <w:top w:w="100" w:type="dxa"/>
               <w:left w:w="100" w:type="dxa"/>
@@ -1404,7 +1550,6 @@
         <w:tc>
           <w:tcPr>
             <w:tcW w:w="1520" w:type="dxa"/>
-            <w:shd w:val="clear" w:color="auto" w:fill="auto"/>
             <w:tcMar>
               <w:top w:w="100" w:type="dxa"/>
               <w:left w:w="100" w:type="dxa"/>
@@ -1441,7 +1586,6 @@
         <w:tc>
           <w:tcPr>
             <w:tcW w:w="4315" w:type="dxa"/>
-            <w:shd w:val="clear" w:color="auto" w:fill="auto"/>
             <w:tcMar>
               <w:top w:w="100" w:type="dxa"/>
               <w:left w:w="100" w:type="dxa"/>
@@ -1471,7 +1615,6 @@
         <w:tc>
           <w:tcPr>
             <w:tcW w:w="1520" w:type="dxa"/>
-            <w:shd w:val="clear" w:color="auto" w:fill="auto"/>
             <w:tcMar>
               <w:top w:w="100" w:type="dxa"/>
               <w:left w:w="100" w:type="dxa"/>
@@ -1508,7 +1651,6 @@
         <w:tc>
           <w:tcPr>
             <w:tcW w:w="4315" w:type="dxa"/>
-            <w:shd w:val="clear" w:color="auto" w:fill="auto"/>
             <w:tcMar>
               <w:top w:w="100" w:type="dxa"/>
               <w:left w:w="100" w:type="dxa"/>
@@ -1717,7 +1859,7 @@
 </file>
 
 <file path=word/endnotes.xml><?xml version="1.0" encoding="utf-8"?>
-<w:endnotes xmlns:wpc="http://schemas.microsoft.com/office/word/2010/wordprocessingCanvas" xmlns:cx="http://schemas.microsoft.com/office/drawing/2014/chartex" xmlns:cx1="http://schemas.microsoft.com/office/drawing/2015/9/8/chartex" xmlns:cx2="http://schemas.microsoft.com/office/drawing/2015/10/21/chartex" xmlns:cx3="http://schemas.microsoft.com/office/drawing/2016/5/9/chartex" xmlns:cx4="http://schemas.microsoft.com/office/drawing/2016/5/10/chartex" xmlns:cx5="http://schemas.microsoft.com/office/drawing/2016/5/11/chartex" xmlns:cx6="http://schemas.microsoft.com/office/drawing/2016/5/12/chartex" xmlns:cx7="http://schemas.microsoft.com/office/drawing/2016/5/13/chartex" xmlns:cx8="http://schemas.microsoft.com/office/drawing/2016/5/14/chartex" xmlns:mc="http://schemas.openxmlformats.org/markup-compatibility/2006" xmlns:aink="http://schemas.microsoft.com/office/drawing/2016/ink" xmlns:am3d="http://schemas.microsoft.com/office/drawing/2017/model3d" xmlns:o="urn:schemas-microsoft-com:office:office" xmlns:oel="http://schemas.microsoft.com/office/2019/extlst" xmlns:r="http://schemas.openxmlformats.org/officeDocument/2006/relationships" xmlns:m="http://schemas.openxmlformats.org/officeDocument/2006/math" xmlns:v="urn:schemas-microsoft-com:vml" xmlns:wp14="http://schemas.microsoft.com/office/word/2010/wordprocessingDrawing" xmlns:wp="http://schemas.openxmlformats.org/drawingml/2006/wordprocessingDrawing" xmlns:w10="urn:schemas-microsoft-com:office:word" xmlns:w="http://schemas.openxmlformats.org/wordprocessingml/2006/main" xmlns:w14="http://schemas.microsoft.com/office/word/2010/wordml" xmlns:w15="http://schemas.microsoft.com/office/word/2012/wordml" xmlns:w16cex="http://schemas.microsoft.com/office/word/2018/wordml/cex" xmlns:w16cid="http://schemas.microsoft.com/office/word/2016/wordml/cid" xmlns:w16="http://schemas.microsoft.com/office/word/2018/wordml" xmlns:w16sdtdh="http://schemas.microsoft.com/office/word/2020/wordml/sdtdatahash" xmlns:w16se="http://schemas.microsoft.com/office/word/2015/wordml/symex" xmlns:wpg="http://schemas.microsoft.com/office/word/2010/wordprocessingGroup" xmlns:wpi="http://schemas.microsoft.com/office/word/2010/wordprocessingInk" xmlns:wne="http://schemas.microsoft.com/office/word/2006/wordml" xmlns:wps="http://schemas.microsoft.com/office/word/2010/wordprocessingShape" mc:Ignorable="w14 w15 w16se w16cid w16 w16cex w16sdtdh wp14">
+<w:endnotes xmlns:wpc="http://schemas.microsoft.com/office/word/2010/wordprocessingCanvas" xmlns:cx="http://schemas.microsoft.com/office/drawing/2014/chartex" xmlns:cx1="http://schemas.microsoft.com/office/drawing/2015/9/8/chartex" xmlns:cx2="http://schemas.microsoft.com/office/drawing/2015/10/21/chartex" xmlns:cx3="http://schemas.microsoft.com/office/drawing/2016/5/9/chartex" xmlns:cx4="http://schemas.microsoft.com/office/drawing/2016/5/10/chartex" xmlns:cx5="http://schemas.microsoft.com/office/drawing/2016/5/11/chartex" xmlns:cx6="http://schemas.microsoft.com/office/drawing/2016/5/12/chartex" xmlns:cx7="http://schemas.microsoft.com/office/drawing/2016/5/13/chartex" xmlns:cx8="http://schemas.microsoft.com/office/drawing/2016/5/14/chartex" xmlns:mc="http://schemas.openxmlformats.org/markup-compatibility/2006" xmlns:aink="http://schemas.microsoft.com/office/drawing/2016/ink" xmlns:am3d="http://schemas.microsoft.com/office/drawing/2017/model3d" xmlns:o="urn:schemas-microsoft-com:office:office" xmlns:oel="http://schemas.microsoft.com/office/2019/extlst" xmlns:r="http://schemas.openxmlformats.org/officeDocument/2006/relationships" xmlns:m="http://schemas.openxmlformats.org/officeDocument/2006/math" xmlns:v="urn:schemas-microsoft-com:vml" xmlns:wp14="http://schemas.microsoft.com/office/word/2010/wordprocessingDrawing" xmlns:wp="http://schemas.openxmlformats.org/drawingml/2006/wordprocessingDrawing" xmlns:w10="urn:schemas-microsoft-com:office:word" xmlns:w="http://schemas.openxmlformats.org/wordprocessingml/2006/main" xmlns:w14="http://schemas.microsoft.com/office/word/2010/wordml" xmlns:w15="http://schemas.microsoft.com/office/word/2012/wordml" xmlns:w16cex="http://schemas.microsoft.com/office/word/2018/wordml/cex" xmlns:w16cid="http://schemas.microsoft.com/office/word/2016/wordml/cid" xmlns:w16="http://schemas.microsoft.com/office/word/2018/wordml" xmlns:w16du="http://schemas.microsoft.com/office/word/2023/wordml/word16du" xmlns:w16sdtdh="http://schemas.microsoft.com/office/word/2020/wordml/sdtdatahash" xmlns:w16sdtfl="http://schemas.microsoft.com/office/word/2024/wordml/sdtformatlock" xmlns:w16se="http://schemas.microsoft.com/office/word/2015/wordml/symex" xmlns:wpg="http://schemas.microsoft.com/office/word/2010/wordprocessingGroup" xmlns:wpi="http://schemas.microsoft.com/office/word/2010/wordprocessingInk" xmlns:wne="http://schemas.microsoft.com/office/word/2006/wordml" xmlns:wps="http://schemas.microsoft.com/office/word/2010/wordprocessingShape" mc:Ignorable="w14 w15 w16se w16cid w16 w16cex w16sdtdh w16sdtfl w16du wp14">
   <w:endnote w:type="separator" w:id="-1">
     <w:p>
       <w:pPr>
@@ -1742,7 +1884,7 @@
 </file>
 
 <file path=word/footer1.xml><?xml version="1.0" encoding="utf-8"?>
-<w:ftr xmlns:wpc="http://schemas.microsoft.com/office/word/2010/wordprocessingCanvas" xmlns:cx="http://schemas.microsoft.com/office/drawing/2014/chartex" xmlns:cx1="http://schemas.microsoft.com/office/drawing/2015/9/8/chartex" xmlns:cx2="http://schemas.microsoft.com/office/drawing/2015/10/21/chartex" xmlns:cx3="http://schemas.microsoft.com/office/drawing/2016/5/9/chartex" xmlns:cx4="http://schemas.microsoft.com/office/drawing/2016/5/10/chartex" xmlns:cx5="http://schemas.microsoft.com/office/drawing/2016/5/11/chartex" xmlns:cx6="http://schemas.microsoft.com/office/drawing/2016/5/12/chartex" xmlns:cx7="http://schemas.microsoft.com/office/drawing/2016/5/13/chartex" xmlns:cx8="http://schemas.microsoft.com/office/drawing/2016/5/14/chartex" xmlns:mc="http://schemas.openxmlformats.org/markup-compatibility/2006" xmlns:aink="http://schemas.microsoft.com/office/drawing/2016/ink" xmlns:am3d="http://schemas.microsoft.com/office/drawing/2017/model3d" xmlns:o="urn:schemas-microsoft-com:office:office" xmlns:oel="http://schemas.microsoft.com/office/2019/extlst" xmlns:r="http://schemas.openxmlformats.org/officeDocument/2006/relationships" xmlns:m="http://schemas.openxmlformats.org/officeDocument/2006/math" xmlns:v="urn:schemas-microsoft-com:vml" xmlns:wp14="http://schemas.microsoft.com/office/word/2010/wordprocessingDrawing" xmlns:wp="http://schemas.openxmlformats.org/drawingml/2006/wordprocessingDrawing" xmlns:w10="urn:schemas-microsoft-com:office:word" xmlns:w="http://schemas.openxmlformats.org/wordprocessingml/2006/main" xmlns:w14="http://schemas.microsoft.com/office/word/2010/wordml" xmlns:w15="http://schemas.microsoft.com/office/word/2012/wordml" xmlns:w16cex="http://schemas.microsoft.com/office/word/2018/wordml/cex" xmlns:w16cid="http://schemas.microsoft.com/office/word/2016/wordml/cid" xmlns:w16="http://schemas.microsoft.com/office/word/2018/wordml" xmlns:w16sdtdh="http://schemas.microsoft.com/office/word/2020/wordml/sdtdatahash" xmlns:w16se="http://schemas.microsoft.com/office/word/2015/wordml/symex" xmlns:wpg="http://schemas.microsoft.com/office/word/2010/wordprocessingGroup" xmlns:wpi="http://schemas.microsoft.com/office/word/2010/wordprocessingInk" xmlns:wne="http://schemas.microsoft.com/office/word/2006/wordml" xmlns:wps="http://schemas.microsoft.com/office/word/2010/wordprocessingShape" mc:Ignorable="w14 w15 w16se w16cid w16 w16cex w16sdtdh wp14">
+<w:ftr xmlns:wpc="http://schemas.microsoft.com/office/word/2010/wordprocessingCanvas" xmlns:cx="http://schemas.microsoft.com/office/drawing/2014/chartex" xmlns:cx1="http://schemas.microsoft.com/office/drawing/2015/9/8/chartex" xmlns:cx2="http://schemas.microsoft.com/office/drawing/2015/10/21/chartex" xmlns:cx3="http://schemas.microsoft.com/office/drawing/2016/5/9/chartex" xmlns:cx4="http://schemas.microsoft.com/office/drawing/2016/5/10/chartex" xmlns:cx5="http://schemas.microsoft.com/office/drawing/2016/5/11/chartex" xmlns:cx6="http://schemas.microsoft.com/office/drawing/2016/5/12/chartex" xmlns:cx7="http://schemas.microsoft.com/office/drawing/2016/5/13/chartex" xmlns:cx8="http://schemas.microsoft.com/office/drawing/2016/5/14/chartex" xmlns:mc="http://schemas.openxmlformats.org/markup-compatibility/2006" xmlns:aink="http://schemas.microsoft.com/office/drawing/2016/ink" xmlns:am3d="http://schemas.microsoft.com/office/drawing/2017/model3d" xmlns:o="urn:schemas-microsoft-com:office:office" xmlns:oel="http://schemas.microsoft.com/office/2019/extlst" xmlns:r="http://schemas.openxmlformats.org/officeDocument/2006/relationships" xmlns:m="http://schemas.openxmlformats.org/officeDocument/2006/math" xmlns:v="urn:schemas-microsoft-com:vml" xmlns:wp14="http://schemas.microsoft.com/office/word/2010/wordprocessingDrawing" xmlns:wp="http://schemas.openxmlformats.org/drawingml/2006/wordprocessingDrawing" xmlns:w10="urn:schemas-microsoft-com:office:word" xmlns:w="http://schemas.openxmlformats.org/wordprocessingml/2006/main" xmlns:w14="http://schemas.microsoft.com/office/word/2010/wordml" xmlns:w15="http://schemas.microsoft.com/office/word/2012/wordml" xmlns:w16cex="http://schemas.microsoft.com/office/word/2018/wordml/cex" xmlns:w16cid="http://schemas.microsoft.com/office/word/2016/wordml/cid" xmlns:w16="http://schemas.microsoft.com/office/word/2018/wordml" xmlns:w16du="http://schemas.microsoft.com/office/word/2023/wordml/word16du" xmlns:w16sdtdh="http://schemas.microsoft.com/office/word/2020/wordml/sdtdatahash" xmlns:w16sdtfl="http://schemas.microsoft.com/office/word/2024/wordml/sdtformatlock" xmlns:w16se="http://schemas.microsoft.com/office/word/2015/wordml/symex" xmlns:wpg="http://schemas.microsoft.com/office/word/2010/wordprocessingGroup" xmlns:wpi="http://schemas.microsoft.com/office/word/2010/wordprocessingInk" xmlns:wne="http://schemas.microsoft.com/office/word/2006/wordml" xmlns:wps="http://schemas.microsoft.com/office/word/2010/wordprocessingShape" mc:Ignorable="w14 w15 w16se w16cid w16 w16cex w16sdtdh w16sdtfl w16du wp14">
   <w:sdt>
     <w:sdtPr>
       <w:rPr>
@@ -1794,7 +1936,7 @@
 </file>
 
 <file path=word/footer2.xml><?xml version="1.0" encoding="utf-8"?>
-<w:ftr xmlns:wpc="http://schemas.microsoft.com/office/word/2010/wordprocessingCanvas" xmlns:cx="http://schemas.microsoft.com/office/drawing/2014/chartex" xmlns:cx1="http://schemas.microsoft.com/office/drawing/2015/9/8/chartex" xmlns:cx2="http://schemas.microsoft.com/office/drawing/2015/10/21/chartex" xmlns:cx3="http://schemas.microsoft.com/office/drawing/2016/5/9/chartex" xmlns:cx4="http://schemas.microsoft.com/office/drawing/2016/5/10/chartex" xmlns:cx5="http://schemas.microsoft.com/office/drawing/2016/5/11/chartex" xmlns:cx6="http://schemas.microsoft.com/office/drawing/2016/5/12/chartex" xmlns:cx7="http://schemas.microsoft.com/office/drawing/2016/5/13/chartex" xmlns:cx8="http://schemas.microsoft.com/office/drawing/2016/5/14/chartex" xmlns:mc="http://schemas.openxmlformats.org/markup-compatibility/2006" xmlns:aink="http://schemas.microsoft.com/office/drawing/2016/ink" xmlns:am3d="http://schemas.microsoft.com/office/drawing/2017/model3d" xmlns:o="urn:schemas-microsoft-com:office:office" xmlns:oel="http://schemas.microsoft.com/office/2019/extlst" xmlns:r="http://schemas.openxmlformats.org/officeDocument/2006/relationships" xmlns:m="http://schemas.openxmlformats.org/officeDocument/2006/math" xmlns:v="urn:schemas-microsoft-com:vml" xmlns:wp14="http://schemas.microsoft.com/office/word/2010/wordprocessingDrawing" xmlns:wp="http://schemas.openxmlformats.org/drawingml/2006/wordprocessingDrawing" xmlns:w10="urn:schemas-microsoft-com:office:word" xmlns:w="http://schemas.openxmlformats.org/wordprocessingml/2006/main" xmlns:w14="http://schemas.microsoft.com/office/word/2010/wordml" xmlns:w15="http://schemas.microsoft.com/office/word/2012/wordml" xmlns:w16cex="http://schemas.microsoft.com/office/word/2018/wordml/cex" xmlns:w16cid="http://schemas.microsoft.com/office/word/2016/wordml/cid" xmlns:w16="http://schemas.microsoft.com/office/word/2018/wordml" xmlns:w16sdtdh="http://schemas.microsoft.com/office/word/2020/wordml/sdtdatahash" xmlns:w16se="http://schemas.microsoft.com/office/word/2015/wordml/symex" xmlns:wpg="http://schemas.microsoft.com/office/word/2010/wordprocessingGroup" xmlns:wpi="http://schemas.microsoft.com/office/word/2010/wordprocessingInk" xmlns:wne="http://schemas.microsoft.com/office/word/2006/wordml" xmlns:wps="http://schemas.microsoft.com/office/word/2010/wordprocessingShape" mc:Ignorable="w14 w15 w16se w16cid w16 w16cex w16sdtdh wp14">
+<w:ftr xmlns:wpc="http://schemas.microsoft.com/office/word/2010/wordprocessingCanvas" xmlns:cx="http://schemas.microsoft.com/office/drawing/2014/chartex" xmlns:cx1="http://schemas.microsoft.com/office/drawing/2015/9/8/chartex" xmlns:cx2="http://schemas.microsoft.com/office/drawing/2015/10/21/chartex" xmlns:cx3="http://schemas.microsoft.com/office/drawing/2016/5/9/chartex" xmlns:cx4="http://schemas.microsoft.com/office/drawing/2016/5/10/chartex" xmlns:cx5="http://schemas.microsoft.com/office/drawing/2016/5/11/chartex" xmlns:cx6="http://schemas.microsoft.com/office/drawing/2016/5/12/chartex" xmlns:cx7="http://schemas.microsoft.com/office/drawing/2016/5/13/chartex" xmlns:cx8="http://schemas.microsoft.com/office/drawing/2016/5/14/chartex" xmlns:mc="http://schemas.openxmlformats.org/markup-compatibility/2006" xmlns:aink="http://schemas.microsoft.com/office/drawing/2016/ink" xmlns:am3d="http://schemas.microsoft.com/office/drawing/2017/model3d" xmlns:o="urn:schemas-microsoft-com:office:office" xmlns:oel="http://schemas.microsoft.com/office/2019/extlst" xmlns:r="http://schemas.openxmlformats.org/officeDocument/2006/relationships" xmlns:m="http://schemas.openxmlformats.org/officeDocument/2006/math" xmlns:v="urn:schemas-microsoft-com:vml" xmlns:wp14="http://schemas.microsoft.com/office/word/2010/wordprocessingDrawing" xmlns:wp="http://schemas.openxmlformats.org/drawingml/2006/wordprocessingDrawing" xmlns:w10="urn:schemas-microsoft-com:office:word" xmlns:w="http://schemas.openxmlformats.org/wordprocessingml/2006/main" xmlns:w14="http://schemas.microsoft.com/office/word/2010/wordml" xmlns:w15="http://schemas.microsoft.com/office/word/2012/wordml" xmlns:w16cex="http://schemas.microsoft.com/office/word/2018/wordml/cex" xmlns:w16cid="http://schemas.microsoft.com/office/word/2016/wordml/cid" xmlns:w16="http://schemas.microsoft.com/office/word/2018/wordml" xmlns:w16du="http://schemas.microsoft.com/office/word/2023/wordml/word16du" xmlns:w16sdtdh="http://schemas.microsoft.com/office/word/2020/wordml/sdtdatahash" xmlns:w16sdtfl="http://schemas.microsoft.com/office/word/2024/wordml/sdtformatlock" xmlns:w16se="http://schemas.microsoft.com/office/word/2015/wordml/symex" xmlns:wpg="http://schemas.microsoft.com/office/word/2010/wordprocessingGroup" xmlns:wpi="http://schemas.microsoft.com/office/word/2010/wordprocessingInk" xmlns:wne="http://schemas.microsoft.com/office/word/2006/wordml" xmlns:wps="http://schemas.microsoft.com/office/word/2010/wordprocessingShape" mc:Ignorable="w14 w15 w16se w16cid w16 w16cex w16sdtdh w16sdtfl w16du wp14">
   <w:sdt>
     <w:sdtPr>
       <w:rPr>
@@ -1859,7 +2001,7 @@
 </file>
 
 <file path=word/footnotes.xml><?xml version="1.0" encoding="utf-8"?>
-<w:footnotes xmlns:wpc="http://schemas.microsoft.com/office/word/2010/wordprocessingCanvas" xmlns:cx="http://schemas.microsoft.com/office/drawing/2014/chartex" xmlns:cx1="http://schemas.microsoft.com/office/drawing/2015/9/8/chartex" xmlns:cx2="http://schemas.microsoft.com/office/drawing/2015/10/21/chartex" xmlns:cx3="http://schemas.microsoft.com/office/drawing/2016/5/9/chartex" xmlns:cx4="http://schemas.microsoft.com/office/drawing/2016/5/10/chartex" xmlns:cx5="http://schemas.microsoft.com/office/drawing/2016/5/11/chartex" xmlns:cx6="http://schemas.microsoft.com/office/drawing/2016/5/12/chartex" xmlns:cx7="http://schemas.microsoft.com/office/drawing/2016/5/13/chartex" xmlns:cx8="http://schemas.microsoft.com/office/drawing/2016/5/14/chartex" xmlns:mc="http://schemas.openxmlformats.org/markup-compatibility/2006" xmlns:aink="http://schemas.microsoft.com/office/drawing/2016/ink" xmlns:am3d="http://schemas.microsoft.com/office/drawing/2017/model3d" xmlns:o="urn:schemas-microsoft-com:office:office" xmlns:oel="http://schemas.microsoft.com/office/2019/extlst" xmlns:r="http://schemas.openxmlformats.org/officeDocument/2006/relationships" xmlns:m="http://schemas.openxmlformats.org/officeDocument/2006/math" xmlns:v="urn:schemas-microsoft-com:vml" xmlns:wp14="http://schemas.microsoft.com/office/word/2010/wordprocessingDrawing" xmlns:wp="http://schemas.openxmlformats.org/drawingml/2006/wordprocessingDrawing" xmlns:w10="urn:schemas-microsoft-com:office:word" xmlns:w="http://schemas.openxmlformats.org/wordprocessingml/2006/main" xmlns:w14="http://schemas.microsoft.com/office/word/2010/wordml" xmlns:w15="http://schemas.microsoft.com/office/word/2012/wordml" xmlns:w16cex="http://schemas.microsoft.com/office/word/2018/wordml/cex" xmlns:w16cid="http://schemas.microsoft.com/office/word/2016/wordml/cid" xmlns:w16="http://schemas.microsoft.com/office/word/2018/wordml" xmlns:w16sdtdh="http://schemas.microsoft.com/office/word/2020/wordml/sdtdatahash" xmlns:w16se="http://schemas.microsoft.com/office/word/2015/wordml/symex" xmlns:wpg="http://schemas.microsoft.com/office/word/2010/wordprocessingGroup" xmlns:wpi="http://schemas.microsoft.com/office/word/2010/wordprocessingInk" xmlns:wne="http://schemas.microsoft.com/office/word/2006/wordml" xmlns:wps="http://schemas.microsoft.com/office/word/2010/wordprocessingShape" mc:Ignorable="w14 w15 w16se w16cid w16 w16cex w16sdtdh wp14">
+<w:footnotes xmlns:wpc="http://schemas.microsoft.com/office/word/2010/wordprocessingCanvas" xmlns:cx="http://schemas.microsoft.com/office/drawing/2014/chartex" xmlns:cx1="http://schemas.microsoft.com/office/drawing/2015/9/8/chartex" xmlns:cx2="http://schemas.microsoft.com/office/drawing/2015/10/21/chartex" xmlns:cx3="http://schemas.microsoft.com/office/drawing/2016/5/9/chartex" xmlns:cx4="http://schemas.microsoft.com/office/drawing/2016/5/10/chartex" xmlns:cx5="http://schemas.microsoft.com/office/drawing/2016/5/11/chartex" xmlns:cx6="http://schemas.microsoft.com/office/drawing/2016/5/12/chartex" xmlns:cx7="http://schemas.microsoft.com/office/drawing/2016/5/13/chartex" xmlns:cx8="http://schemas.microsoft.com/office/drawing/2016/5/14/chartex" xmlns:mc="http://schemas.openxmlformats.org/markup-compatibility/2006" xmlns:aink="http://schemas.microsoft.com/office/drawing/2016/ink" xmlns:am3d="http://schemas.microsoft.com/office/drawing/2017/model3d" xmlns:o="urn:schemas-microsoft-com:office:office" xmlns:oel="http://schemas.microsoft.com/office/2019/extlst" xmlns:r="http://schemas.openxmlformats.org/officeDocument/2006/relationships" xmlns:m="http://schemas.openxmlformats.org/officeDocument/2006/math" xmlns:v="urn:schemas-microsoft-com:vml" xmlns:wp14="http://schemas.microsoft.com/office/word/2010/wordprocessingDrawing" xmlns:wp="http://schemas.openxmlformats.org/drawingml/2006/wordprocessingDrawing" xmlns:w10="urn:schemas-microsoft-com:office:word" xmlns:w="http://schemas.openxmlformats.org/wordprocessingml/2006/main" xmlns:w14="http://schemas.microsoft.com/office/word/2010/wordml" xmlns:w15="http://schemas.microsoft.com/office/word/2012/wordml" xmlns:w16cex="http://schemas.microsoft.com/office/word/2018/wordml/cex" xmlns:w16cid="http://schemas.microsoft.com/office/word/2016/wordml/cid" xmlns:w16="http://schemas.microsoft.com/office/word/2018/wordml" xmlns:w16du="http://schemas.microsoft.com/office/word/2023/wordml/word16du" xmlns:w16sdtdh="http://schemas.microsoft.com/office/word/2020/wordml/sdtdatahash" xmlns:w16sdtfl="http://schemas.microsoft.com/office/word/2024/wordml/sdtformatlock" xmlns:w16se="http://schemas.microsoft.com/office/word/2015/wordml/symex" xmlns:wpg="http://schemas.microsoft.com/office/word/2010/wordprocessingGroup" xmlns:wpi="http://schemas.microsoft.com/office/word/2010/wordprocessingInk" xmlns:wne="http://schemas.microsoft.com/office/word/2006/wordml" xmlns:wps="http://schemas.microsoft.com/office/word/2010/wordprocessingShape" mc:Ignorable="w14 w15 w16se w16cid w16 w16cex w16sdtdh w16sdtfl w16du wp14">
   <w:footnote w:type="separator" w:id="-1">
     <w:p>
       <w:pPr>
@@ -1884,7 +2026,7 @@
 </file>
 
 <file path=word/header1.xml><?xml version="1.0" encoding="utf-8"?>
-<w:hdr xmlns:wpc="http://schemas.microsoft.com/office/word/2010/wordprocessingCanvas" xmlns:cx="http://schemas.microsoft.com/office/drawing/2014/chartex" xmlns:cx1="http://schemas.microsoft.com/office/drawing/2015/9/8/chartex" xmlns:cx2="http://schemas.microsoft.com/office/drawing/2015/10/21/chartex" xmlns:cx3="http://schemas.microsoft.com/office/drawing/2016/5/9/chartex" xmlns:cx4="http://schemas.microsoft.com/office/drawing/2016/5/10/chartex" xmlns:cx5="http://schemas.microsoft.com/office/drawing/2016/5/11/chartex" xmlns:cx6="http://schemas.microsoft.com/office/drawing/2016/5/12/chartex" xmlns:cx7="http://schemas.microsoft.com/office/drawing/2016/5/13/chartex" xmlns:cx8="http://schemas.microsoft.com/office/drawing/2016/5/14/chartex" xmlns:mc="http://schemas.openxmlformats.org/markup-compatibility/2006" xmlns:aink="http://schemas.microsoft.com/office/drawing/2016/ink" xmlns:am3d="http://schemas.microsoft.com/office/drawing/2017/model3d" xmlns:o="urn:schemas-microsoft-com:office:office" xmlns:oel="http://schemas.microsoft.com/office/2019/extlst" xmlns:r="http://schemas.openxmlformats.org/officeDocument/2006/relationships" xmlns:m="http://schemas.openxmlformats.org/officeDocument/2006/math" xmlns:v="urn:schemas-microsoft-com:vml" xmlns:wp14="http://schemas.microsoft.com/office/word/2010/wordprocessingDrawing" xmlns:wp="http://schemas.openxmlformats.org/drawingml/2006/wordprocessingDrawing" xmlns:w10="urn:schemas-microsoft-com:office:word" xmlns:w="http://schemas.openxmlformats.org/wordprocessingml/2006/main" xmlns:w14="http://schemas.microsoft.com/office/word/2010/wordml" xmlns:w15="http://schemas.microsoft.com/office/word/2012/wordml" xmlns:w16cex="http://schemas.microsoft.com/office/word/2018/wordml/cex" xmlns:w16cid="http://schemas.microsoft.com/office/word/2016/wordml/cid" xmlns:w16="http://schemas.microsoft.com/office/word/2018/wordml" xmlns:w16sdtdh="http://schemas.microsoft.com/office/word/2020/wordml/sdtdatahash" xmlns:w16se="http://schemas.microsoft.com/office/word/2015/wordml/symex" xmlns:wpg="http://schemas.microsoft.com/office/word/2010/wordprocessingGroup" xmlns:wpi="http://schemas.microsoft.com/office/word/2010/wordprocessingInk" xmlns:wne="http://schemas.microsoft.com/office/word/2006/wordml" xmlns:wps="http://schemas.microsoft.com/office/word/2010/wordprocessingShape" mc:Ignorable="w14 w15 w16se w16cid w16 w16cex w16sdtdh wp14">
+<w:hdr xmlns:wpc="http://schemas.microsoft.com/office/word/2010/wordprocessingCanvas" xmlns:cx="http://schemas.microsoft.com/office/drawing/2014/chartex" xmlns:cx1="http://schemas.microsoft.com/office/drawing/2015/9/8/chartex" xmlns:cx2="http://schemas.microsoft.com/office/drawing/2015/10/21/chartex" xmlns:cx3="http://schemas.microsoft.com/office/drawing/2016/5/9/chartex" xmlns:cx4="http://schemas.microsoft.com/office/drawing/2016/5/10/chartex" xmlns:cx5="http://schemas.microsoft.com/office/drawing/2016/5/11/chartex" xmlns:cx6="http://schemas.microsoft.com/office/drawing/2016/5/12/chartex" xmlns:cx7="http://schemas.microsoft.com/office/drawing/2016/5/13/chartex" xmlns:cx8="http://schemas.microsoft.com/office/drawing/2016/5/14/chartex" xmlns:mc="http://schemas.openxmlformats.org/markup-compatibility/2006" xmlns:aink="http://schemas.microsoft.com/office/drawing/2016/ink" xmlns:am3d="http://schemas.microsoft.com/office/drawing/2017/model3d" xmlns:o="urn:schemas-microsoft-com:office:office" xmlns:oel="http://schemas.microsoft.com/office/2019/extlst" xmlns:r="http://schemas.openxmlformats.org/officeDocument/2006/relationships" xmlns:m="http://schemas.openxmlformats.org/officeDocument/2006/math" xmlns:v="urn:schemas-microsoft-com:vml" xmlns:wp14="http://schemas.microsoft.com/office/word/2010/wordprocessingDrawing" xmlns:wp="http://schemas.openxmlformats.org/drawingml/2006/wordprocessingDrawing" xmlns:w10="urn:schemas-microsoft-com:office:word" xmlns:w="http://schemas.openxmlformats.org/wordprocessingml/2006/main" xmlns:w14="http://schemas.microsoft.com/office/word/2010/wordml" xmlns:w15="http://schemas.microsoft.com/office/word/2012/wordml" xmlns:w16cex="http://schemas.microsoft.com/office/word/2018/wordml/cex" xmlns:w16cid="http://schemas.microsoft.com/office/word/2016/wordml/cid" xmlns:w16="http://schemas.microsoft.com/office/word/2018/wordml" xmlns:w16du="http://schemas.microsoft.com/office/word/2023/wordml/word16du" xmlns:w16sdtdh="http://schemas.microsoft.com/office/word/2020/wordml/sdtdatahash" xmlns:w16sdtfl="http://schemas.microsoft.com/office/word/2024/wordml/sdtformatlock" xmlns:w16se="http://schemas.microsoft.com/office/word/2015/wordml/symex" xmlns:wpg="http://schemas.microsoft.com/office/word/2010/wordprocessingGroup" xmlns:wpi="http://schemas.microsoft.com/office/word/2010/wordprocessingInk" xmlns:wne="http://schemas.microsoft.com/office/word/2006/wordml" xmlns:wps="http://schemas.microsoft.com/office/word/2010/wordprocessingShape" mc:Ignorable="w14 w15 w16se w16cid w16 w16cex w16sdtdh w16sdtfl w16du wp14">
   <w:p>
     <w:pPr>
       <w:pStyle w:val="Header"/>
@@ -1901,7 +2043,7 @@
 </file>
 
 <file path=word/numbering.xml><?xml version="1.0" encoding="utf-8"?>
-<w:numbering xmlns:wpc="http://schemas.microsoft.com/office/word/2010/wordprocessingCanvas" xmlns:cx="http://schemas.microsoft.com/office/drawing/2014/chartex" xmlns:cx1="http://schemas.microsoft.com/office/drawing/2015/9/8/chartex" xmlns:cx2="http://schemas.microsoft.com/office/drawing/2015/10/21/chartex" xmlns:cx3="http://schemas.microsoft.com/office/drawing/2016/5/9/chartex" xmlns:cx4="http://schemas.microsoft.com/office/drawing/2016/5/10/chartex" xmlns:cx5="http://schemas.microsoft.com/office/drawing/2016/5/11/chartex" xmlns:cx6="http://schemas.microsoft.com/office/drawing/2016/5/12/chartex" xmlns:cx7="http://schemas.microsoft.com/office/drawing/2016/5/13/chartex" xmlns:cx8="http://schemas.microsoft.com/office/drawing/2016/5/14/chartex" xmlns:mc="http://schemas.openxmlformats.org/markup-compatibility/2006" xmlns:aink="http://schemas.microsoft.com/office/drawing/2016/ink" xmlns:am3d="http://schemas.microsoft.com/office/drawing/2017/model3d" xmlns:o="urn:schemas-microsoft-com:office:office" xmlns:oel="http://schemas.microsoft.com/office/2019/extlst" xmlns:r="http://schemas.openxmlformats.org/officeDocument/2006/relationships" xmlns:m="http://schemas.openxmlformats.org/officeDocument/2006/math" xmlns:v="urn:schemas-microsoft-com:vml" xmlns:wp14="http://schemas.microsoft.com/office/word/2010/wordprocessingDrawing" xmlns:wp="http://schemas.openxmlformats.org/drawingml/2006/wordprocessingDrawing" xmlns:w10="urn:schemas-microsoft-com:office:word" xmlns:w="http://schemas.openxmlformats.org/wordprocessingml/2006/main" xmlns:w14="http://schemas.microsoft.com/office/word/2010/wordml" xmlns:w15="http://schemas.microsoft.com/office/word/2012/wordml" xmlns:w16cex="http://schemas.microsoft.com/office/word/2018/wordml/cex" xmlns:w16cid="http://schemas.microsoft.com/office/word/2016/wordml/cid" xmlns:w16="http://schemas.microsoft.com/office/word/2018/wordml" xmlns:w16sdtdh="http://schemas.microsoft.com/office/word/2020/wordml/sdtdatahash" xmlns:w16se="http://schemas.microsoft.com/office/word/2015/wordml/symex" xmlns:wpg="http://schemas.microsoft.com/office/word/2010/wordprocessingGroup" xmlns:wpi="http://schemas.microsoft.com/office/word/2010/wordprocessingInk" xmlns:wne="http://schemas.microsoft.com/office/word/2006/wordml" xmlns:wps="http://schemas.microsoft.com/office/word/2010/wordprocessingShape" mc:Ignorable="w14 w15 w16se w16cid w16 w16cex w16sdtdh wp14">
+<w:numbering xmlns:wpc="http://schemas.microsoft.com/office/word/2010/wordprocessingCanvas" xmlns:cx="http://schemas.microsoft.com/office/drawing/2014/chartex" xmlns:cx1="http://schemas.microsoft.com/office/drawing/2015/9/8/chartex" xmlns:cx2="http://schemas.microsoft.com/office/drawing/2015/10/21/chartex" xmlns:cx3="http://schemas.microsoft.com/office/drawing/2016/5/9/chartex" xmlns:cx4="http://schemas.microsoft.com/office/drawing/2016/5/10/chartex" xmlns:cx5="http://schemas.microsoft.com/office/drawing/2016/5/11/chartex" xmlns:cx6="http://schemas.microsoft.com/office/drawing/2016/5/12/chartex" xmlns:cx7="http://schemas.microsoft.com/office/drawing/2016/5/13/chartex" xmlns:cx8="http://schemas.microsoft.com/office/drawing/2016/5/14/chartex" xmlns:mc="http://schemas.openxmlformats.org/markup-compatibility/2006" xmlns:aink="http://schemas.microsoft.com/office/drawing/2016/ink" xmlns:am3d="http://schemas.microsoft.com/office/drawing/2017/model3d" xmlns:o="urn:schemas-microsoft-com:office:office" xmlns:oel="http://schemas.microsoft.com/office/2019/extlst" xmlns:r="http://schemas.openxmlformats.org/officeDocument/2006/relationships" xmlns:m="http://schemas.openxmlformats.org/officeDocument/2006/math" xmlns:v="urn:schemas-microsoft-com:vml" xmlns:wp14="http://schemas.microsoft.com/office/word/2010/wordprocessingDrawing" xmlns:wp="http://schemas.openxmlformats.org/drawingml/2006/wordprocessingDrawing" xmlns:w10="urn:schemas-microsoft-com:office:word" xmlns:w="http://schemas.openxmlformats.org/wordprocessingml/2006/main" xmlns:w14="http://schemas.microsoft.com/office/word/2010/wordml" xmlns:w15="http://schemas.microsoft.com/office/word/2012/wordml" xmlns:w16cex="http://schemas.microsoft.com/office/word/2018/wordml/cex" xmlns:w16cid="http://schemas.microsoft.com/office/word/2016/wordml/cid" xmlns:w16="http://schemas.microsoft.com/office/word/2018/wordml" xmlns:w16du="http://schemas.microsoft.com/office/word/2023/wordml/word16du" xmlns:w16sdtdh="http://schemas.microsoft.com/office/word/2020/wordml/sdtdatahash" xmlns:w16sdtfl="http://schemas.microsoft.com/office/word/2024/wordml/sdtformatlock" xmlns:w16se="http://schemas.microsoft.com/office/word/2015/wordml/symex" xmlns:wpg="http://schemas.microsoft.com/office/word/2010/wordprocessingGroup" xmlns:wpi="http://schemas.microsoft.com/office/word/2010/wordprocessingInk" xmlns:wne="http://schemas.microsoft.com/office/word/2006/wordml" xmlns:wps="http://schemas.microsoft.com/office/word/2010/wordprocessingShape" mc:Ignorable="w14 w15 w16se w16cid w16 w16cex w16sdtdh w16sdtfl w16du wp14">
   <w:abstractNum w:abstractNumId="0" w15:restartNumberingAfterBreak="0">
     <w:nsid w:val="2EFE7CB4"/>
     <w:multiLevelType w:val="hybridMultilevel"/>
@@ -2084,7 +2226,7 @@
 </file>
 
 <file path=word/styles.xml><?xml version="1.0" encoding="utf-8"?>
-<w:styles xmlns:mc="http://schemas.openxmlformats.org/markup-compatibility/2006" xmlns:r="http://schemas.openxmlformats.org/officeDocument/2006/relationships" xmlns:w="http://schemas.openxmlformats.org/wordprocessingml/2006/main" xmlns:w14="http://schemas.microsoft.com/office/word/2010/wordml" xmlns:w15="http://schemas.microsoft.com/office/word/2012/wordml" xmlns:w16cex="http://schemas.microsoft.com/office/word/2018/wordml/cex" xmlns:w16cid="http://schemas.microsoft.com/office/word/2016/wordml/cid" xmlns:w16="http://schemas.microsoft.com/office/word/2018/wordml" xmlns:w16sdtdh="http://schemas.microsoft.com/office/word/2020/wordml/sdtdatahash" xmlns:w16se="http://schemas.microsoft.com/office/word/2015/wordml/symex" mc:Ignorable="w14 w15 w16se w16cid w16 w16cex w16sdtdh">
+<w:styles xmlns:mc="http://schemas.openxmlformats.org/markup-compatibility/2006" xmlns:r="http://schemas.openxmlformats.org/officeDocument/2006/relationships" xmlns:w="http://schemas.openxmlformats.org/wordprocessingml/2006/main" xmlns:w14="http://schemas.microsoft.com/office/word/2010/wordml" xmlns:w15="http://schemas.microsoft.com/office/word/2012/wordml" xmlns:w16cex="http://schemas.microsoft.com/office/word/2018/wordml/cex" xmlns:w16cid="http://schemas.microsoft.com/office/word/2016/wordml/cid" xmlns:w16="http://schemas.microsoft.com/office/word/2018/wordml" xmlns:w16du="http://schemas.microsoft.com/office/word/2023/wordml/word16du" xmlns:w16sdtdh="http://schemas.microsoft.com/office/word/2020/wordml/sdtdatahash" xmlns:w16sdtfl="http://schemas.microsoft.com/office/word/2024/wordml/sdtformatlock" xmlns:w16se="http://schemas.microsoft.com/office/word/2015/wordml/symex" mc:Ignorable="w14 w15 w16se w16cid w16 w16cex w16sdtdh w16sdtfl w16du">
   <w:docDefaults>
     <w:rPrDefault>
       <w:rPr>
@@ -2481,6 +2623,7 @@
   <w:style w:type="paragraph" w:default="1" w:styleId="Normal">
     <w:name w:val="Normal"/>
     <w:qFormat/>
+    <w:rsid w:val="00944ABD"/>
   </w:style>
   <w:style w:type="paragraph" w:styleId="Heading1">
     <w:name w:val="heading 1"/>

</xml_diff>